<commit_message>
Regenerate all proposals, manuals, and layout documents in plain black and white format with no table shading or themes
</commit_message>
<xml_diff>
--- a/docs/01_educational_innovation_proposal_timetable.docx
+++ b/docs/01_educational_innovation_proposal_timetable.docx
@@ -13,7 +13,7 @@
           <w:b/>
           <w:i w:val="0"/>
           <w:color w:val="000000"/>
-          <w:sz w:val="40"/>
+          <w:sz w:val="36"/>
         </w:rPr>
         <w:t>บันทึกข้อความ</w:t>
       </w:r>
@@ -246,7 +246,7 @@
     <w:p/>
     <w:p>
       <w:pPr>
-        <w:spacing w:before="0" w:after="120" w:line="276" w:lineRule="auto"/>
+        <w:spacing w:before="160" w:after="120" w:line="276" w:lineRule="auto"/>
         <w:jc w:val="left"/>
       </w:pPr>
       <w:r>
@@ -254,7 +254,7 @@
           <w:rFonts w:ascii="TH Sarabun New" w:hAnsi="TH Sarabun New" w:eastAsia="TH Sarabun New"/>
           <w:b/>
           <w:i w:val="0"/>
-          <w:color w:val="1A2F4E"/>
+          <w:color w:val="000000"/>
           <w:sz w:val="30"/>
         </w:rPr>
         <w:t>1. ชื่อผลงานวิชาการด้านการศึกษา</w:t>
@@ -282,7 +282,7 @@
     </w:p>
     <w:p>
       <w:pPr>
-        <w:spacing w:before="0" w:after="120" w:line="276" w:lineRule="auto"/>
+        <w:spacing w:before="160" w:after="120" w:line="276" w:lineRule="auto"/>
         <w:jc w:val="left"/>
       </w:pPr>
       <w:r>
@@ -290,7 +290,7 @@
           <w:rFonts w:ascii="TH Sarabun New" w:hAnsi="TH Sarabun New" w:eastAsia="TH Sarabun New"/>
           <w:b/>
           <w:i w:val="0"/>
-          <w:color w:val="1A2F4E"/>
+          <w:color w:val="000000"/>
           <w:sz w:val="30"/>
         </w:rPr>
         <w:t>2. รายชื่อคณะผู้จัดทำ</w:t>
@@ -309,14 +309,14 @@
           <w:color w:val="000000"/>
           <w:sz w:val="28"/>
         </w:rPr>
-        <w:t xml:space="preserve">   1) พ.ต. ณัฐพล พัฒนกุล (อาจารย์ โรงเรียนทหารขนส่ง กรมการขนส่งทหารบก)</w:t>
+        <w:t xml:space="preserve">   พ.ต. ณัฐพล พัฒนกุล (อาจารย์ โรงเรียนทหารขนส่ง กรมการขนส่งทหารบก)</w:t>
         <w:br/>
-        <w:t xml:space="preserve">      อีเมล: nattapon.ats01@gmail.com   โทรศัพท์: 090-924-2555</w:t>
+        <w:t xml:space="preserve">   อีเมล: nattapon.ats01@gmail.com   โทรศัพท์: 090-924-2555</w:t>
       </w:r>
     </w:p>
     <w:p>
       <w:pPr>
-        <w:spacing w:before="0" w:after="120" w:line="276" w:lineRule="auto"/>
+        <w:spacing w:before="160" w:after="120" w:line="276" w:lineRule="auto"/>
         <w:jc w:val="left"/>
       </w:pPr>
       <w:r>
@@ -324,7 +324,7 @@
           <w:rFonts w:ascii="TH Sarabun New" w:hAnsi="TH Sarabun New" w:eastAsia="TH Sarabun New"/>
           <w:b/>
           <w:i w:val="0"/>
-          <w:color w:val="1A2F4E"/>
+          <w:color w:val="000000"/>
           <w:sz w:val="30"/>
         </w:rPr>
         <w:t>3. สถานศึกษา/สถาบันการศึกษาที่สังกัด</w:t>
@@ -343,12 +343,12 @@
           <w:color w:val="000000"/>
           <w:sz w:val="28"/>
         </w:rPr>
-        <w:t xml:space="preserve">   โรงเรียนทหารขนส่ง กรมการขนส่งทหารบก ค่ายกำแพงเพชรอัครโยธิน</w:t>
+        <w:t xml:space="preserve">   โรงเรียนทหารขนส่ง กรมการขนส่งทหารบก</w:t>
       </w:r>
     </w:p>
     <w:p>
       <w:pPr>
-        <w:spacing w:before="0" w:after="120" w:line="276" w:lineRule="auto"/>
+        <w:spacing w:before="160" w:after="120" w:line="276" w:lineRule="auto"/>
         <w:jc w:val="left"/>
       </w:pPr>
       <w:r>
@@ -356,7 +356,7 @@
           <w:rFonts w:ascii="TH Sarabun New" w:hAnsi="TH Sarabun New" w:eastAsia="TH Sarabun New"/>
           <w:b/>
           <w:i w:val="0"/>
-          <w:color w:val="1A2F4E"/>
+          <w:color w:val="000000"/>
           <w:sz w:val="30"/>
         </w:rPr>
         <w:t>4. ที่มาของแนวคิดในการพัฒนาผลงานวิชาการด้านการศึกษา</w:t>
@@ -375,28 +375,12 @@
           <w:color w:val="000000"/>
           <w:sz w:val="28"/>
         </w:rPr>
-        <w:t>จากการประเมินผลการเรียนการสอนของโรงเรียนทหารขนส่งที่ผ่านมา พบปัญหาหลักในด้านการบริหารจัดการเวลาเรียนและตารางสอน เนื่องจากหลักสูตรการฝึกศึกษามีหลายรุ่นพร้อมกัน ครูผู้สอนส่วนใหญ่เป็นนายทหารสัญญาบัตรที่มีภารกิจฝึกและปฏิบัติการภายนอกบ่อยครั้ง ทำให้ตารางเรียนประจำสัปดาห์ต้องปรับปรุงแก้ไขตลอดเวลา เมื่อมีแก้ไขตารางด้วยระบบเดิม (Excel/พิมพ์กระดาษแจก) มักทำให้ข้อมูลตกหล่น ครูสอนและห้องเรียนเกิดตารางชนกัน และข้อมูลตารางสอนอัพเดทไม่ถึงมือนักเรียนนายสิบในกองร้อยเรียนอย่างทันเวลา สร้างความเสียหายเชิงการศึกษาและขัดต่อมาตรฐานคุณภาพการฝึกอบรม ยศ.ทบ. พ.ศ. 2566 – 2570 มาตรฐานที่ 1 ตัวชี้วัดที่ 2 ที่เน้นย้ำเรื่องการนำเทคโนโลยีดิจิทัลมาเพิ่มประสิทธิภาพการเรียนรู้</w:t>
+        <w:t>หลักสูตรเรียนของโรงเรียนทหารขนส่ง กรมการขนส่งทหารบก มักมีการปรับแผนและเปลี่ยนวิชาสอนกะทันหันบ่อยครั้งเนื่องจากภารกิจทหาร ทำให้ตารางสอนกระดาษหรือ Excel เดิมต้องแก้ใหม่รายสัปดาห์ ข้อมูลเวลาเรียนและผู้ตรวจอนุมัติสะสมชั่วโมงไม่ตรงกัน ทำให้เกิดความล่าช้าในการเผยแพร่และตารางเรียนชนกัน ซึ่งขัดต่อมาตรฐานคุณภาพการเรียนรู้ ยศ.ทบ. พ.ศ. 2566 – 2570 ดังนั้น กองการศึกษา รร.ขส.ขส.ทบ. จึงเห็นควรพัฒนา 'ระบบตารางสอนประจำสัปดาห์แบบเรียลไทม์' ซึ่งโฮสต์ฟรีแบบออฟไลน์และออนไลน์พร้อมสตรีมเหตุการณ์ซิงค์ข้อมูลผ่าน Google Firebase และ GitHub Pages อัตโนมัติ นวัตกรรมนี้นอกจากจะคำนวณชั่วโมงสะสมถูกต้องรวดเร็วแล้ว ยังรักษาความปลอดภัยข้อมูลรหัสผ่านแอดมินด้วย SHA-256 Hashing ฝั่งไคลเอนต์</w:t>
       </w:r>
     </w:p>
     <w:p>
       <w:pPr>
-        <w:spacing w:before="0" w:after="120" w:line="276" w:lineRule="auto"/>
-        <w:jc w:val="left"/>
-      </w:pPr>
-      <w:r>
-        <w:rPr>
-          <w:rFonts w:ascii="TH Sarabun New" w:hAnsi="TH Sarabun New" w:eastAsia="TH Sarabun New"/>
-          <w:b w:val="0"/>
-          <w:i w:val="0"/>
-          <w:color w:val="000000"/>
-          <w:sz w:val="28"/>
-        </w:rPr>
-        <w:t>ผู้พัฒนาจึงพัฒนา 'ระบบตารางสอนประจำสัปดาห์แบบเรียลไทม์' ขึ้น โดยออกแบบซอฟต์แวร์ให้เก็บข้อมูลบนก้อนคลาวด์ Firebase และส่งสตรีมข่าวสารแบบเรียลไทม์ข้ามอุปกรณ์ และเพิ่มสิทธิ์รักษาความปลอดภัยรหัสผ่านผู้ดูแลระบบด้วย SHA-256 Hashing เพื่อป้องกันการสืบข้อมูลความลับส่วนบุคคลตาม พ.ร.บ. คุ้มครองข้อมูลส่วนบุคคล (PDPA) อีกทั้งมีสิทธิ์สำรองข้อมูล data.json ขึ้นระบบ Git control ของ GitHub Pages อัตโนมัติ ทำให้ระบบตารางสอนมีความเสถียรและทำงานออฟไลน์ได้โดยไม่ต้องเช่าเซิร์ฟเวอร์</w:t>
-      </w:r>
-    </w:p>
-    <w:p>
-      <w:pPr>
-        <w:spacing w:before="0" w:after="120" w:line="276" w:lineRule="auto"/>
+        <w:spacing w:before="160" w:after="120" w:line="276" w:lineRule="auto"/>
         <w:jc w:val="left"/>
       </w:pPr>
       <w:r>
@@ -404,7 +388,7 @@
           <w:rFonts w:ascii="TH Sarabun New" w:hAnsi="TH Sarabun New" w:eastAsia="TH Sarabun New"/>
           <w:b/>
           <w:i w:val="0"/>
-          <w:color w:val="1A2F4E"/>
+          <w:color w:val="000000"/>
           <w:sz w:val="30"/>
         </w:rPr>
         <w:t>5. วัตถุประสงค์</w:t>
@@ -423,21 +407,16 @@
           <w:color w:val="000000"/>
           <w:sz w:val="28"/>
         </w:rPr>
-        <w:t xml:space="preserve">   1. เพื่อพัฒนาระบบซอฟต์แวร์บริหารตารางสอนเรียลไทม์คลาวด์ ป้องกันตารางชนกันและคำนวณชั่วโมงสะสมวิชาเรียนถูกต้อง 100%</w:t>
+        <w:t xml:space="preserve">   1. เพื่อพัฒนาระบบซอฟต์แวร์จัดการตารางเรียนเรียลไทม์คลาวด์ ป้องกันตารางชนและคำนวณชั่วโมงสะสมวิชาเรียนถูกต้อง 100%</w:t>
         <w:br/>
-        <w:t xml:space="preserve">   2. เพื่อยกระดับความมั่นคงปลอดภัยความลับทางทหาร และรักษาความปลอดภัยข้อมูลรหัสผ่านบัญชีแอดมินด้วย SHA-256 Hashing</w:t>
+        <w:t xml:space="preserve">   2. เพื่อรักษาความปลอดภัยข้อมูลและควบคุมสิทธิ์การเข้าถึงฐานข้อมูล Firebase ด้วย Database Secrets และ SHA-256 Hashing</w:t>
         <w:br/>
-        <w:t xml:space="preserve">   3. เพื่อเพิ่มความพึงพอใจการเข้าถึงข้อมูลตารางเรียนครูและนักเรียนผ่านสมาร์ทโฟนได้จากทุกที่ตลอด 24 ชั่วโมง</w:t>
-      </w:r>
-    </w:p>
-    <w:p>
-      <w:r>
-        <w:br w:type="page"/>
+        <w:t xml:space="preserve">   3. เพื่อเพิ่มความพึงพอใจการเข้าถึงข้อมูลตารางเรียนครูและนักเรียนผ่านสมาร์ทโฟน</w:t>
       </w:r>
     </w:p>
     <w:p>
       <w:pPr>
-        <w:spacing w:before="0" w:after="120" w:line="276" w:lineRule="auto"/>
+        <w:spacing w:before="160" w:after="120" w:line="276" w:lineRule="auto"/>
         <w:jc w:val="left"/>
       </w:pPr>
       <w:r>
@@ -445,7 +424,7 @@
           <w:rFonts w:ascii="TH Sarabun New" w:hAnsi="TH Sarabun New" w:eastAsia="TH Sarabun New"/>
           <w:b/>
           <w:i w:val="0"/>
-          <w:color w:val="1A2F4E"/>
+          <w:color w:val="000000"/>
           <w:sz w:val="30"/>
         </w:rPr>
         <w:t>6. คุณสมบัติ/คุณลักษณะเฉพาะและขอบเขตการใช้งานของผลงาน</w:t>
@@ -464,18 +443,18 @@
           <w:color w:val="000000"/>
           <w:sz w:val="28"/>
         </w:rPr>
-        <w:t xml:space="preserve">   •  เป็นซอฟต์แวร์ Single Page Application (SPA) โหลดรวดเร็ว ปลอดภัยสูง ทำงานได้บนเว็บเบราว์เซอร์ทุกระบบปฏิบัติการ</w:t>
+        <w:t xml:space="preserve">   •  เป็นซอฟต์แวร์ Single Page Application (SPA) ทำงานได้รวดเร็ว โครงสร้างหน้าจอไม่ซับซ้อน ไฟล์ขนาดเบามาก</w:t>
         <w:br/>
-        <w:t xml:space="preserve">   •  การจัดการความปลอดภัย: เข้ารหัสผ่านบัญชีฝั่งเบราว์เซอร์ด้วย SHA-256 และส่ง REST API คู่กับคีย์รักษาความปลอดภัยฐานข้อมูล (?auth=)</w:t>
+        <w:t xml:space="preserve">   •  การแฮชรหัสผ่าน: เข้ารหัสผ่านบัญชีฝั่งเบราว์เซอร์ด้วย SHA-256 และส่ง REST API คู่กับ Database Secrets จำกัดสิทธิ์คลาวด์</w:t>
         <w:br/>
-        <w:t xml:space="preserve">   •  ระบบซิงค์เรียลไทม์: เทคโนโลยี Server-Sent Events (SSE) คลาส EventSource ซิงค์ตารางเรียนทันทีเมื่อมีการบันทึกการจัดตารางสอน</w:t>
+        <w:t xml:space="preserve">   •  ระบบซิงค์เรียลไทม์: เทคโนโลยี Server-Sent Events (SSE) คลาส EventSource ช่วยให้เครื่องแอดมินอัพเดทตารางร่วมกันเรียลไทม์</w:t>
         <w:br/>
-        <w:t xml:space="preserve">   •  ขอบเขตการทำงาน: บริหารชื่อโรงเรียน, ครูอาจารย์, วิชาเรียนตามหลักสูตรสะสม, ห้องเรียน, วันหยุดเรียน และการสั่งพิมพ์ A4 เป็นเลขไทย</w:t>
+        <w:t xml:space="preserve">   •  ขอบเขตการทำงาน: บริหารชื่อโรงเรียน, ครูอาจารย์, วิชาเรียนสะสม, ห้องเรียน, วันหยุดเรียน และปุ่มพิมพ์ A4 เลขไทย</w:t>
       </w:r>
     </w:p>
     <w:p>
       <w:pPr>
-        <w:spacing w:before="0" w:after="120" w:line="276" w:lineRule="auto"/>
+        <w:spacing w:before="160" w:after="120" w:line="276" w:lineRule="auto"/>
         <w:jc w:val="left"/>
       </w:pPr>
       <w:r>
@@ -483,34 +462,25 @@
           <w:rFonts w:ascii="TH Sarabun New" w:hAnsi="TH Sarabun New" w:eastAsia="TH Sarabun New"/>
           <w:b/>
           <w:i w:val="0"/>
-          <w:color w:val="1A2F4E"/>
+          <w:color w:val="000000"/>
           <w:sz w:val="30"/>
         </w:rPr>
         <w:t>7. หลักการ วิธีการ และขั้นตอนการทำงานของผลงาน</w:t>
       </w:r>
     </w:p>
-    <w:p>
-      <w:pPr>
-        <w:spacing w:before="0" w:after="120" w:line="276" w:lineRule="auto"/>
-        <w:jc w:val="left"/>
-      </w:pPr>
-      <w:r>
-        <w:rPr>
-          <w:rFonts w:ascii="TH Sarabun New" w:hAnsi="TH Sarabun New" w:eastAsia="TH Sarabun New"/>
-          <w:b w:val="0"/>
-          <w:i w:val="0"/>
-          <w:color w:val="000000"/>
-          <w:sz w:val="28"/>
-        </w:rPr>
-        <w:t xml:space="preserve">   การพัฒนาดำเนินงานแบ่งเป็นวงจร PDCA (Plan-Do-Check-Action) ตามมาตรฐานพัฒนาคุณภาพการศึกษา ดังนี้:</w:t>
-      </w:r>
-    </w:p>
     <w:tbl>
       <w:tblPr>
-        <w:tblStyle w:val="TableGrid"/>
         <w:tblW w:type="auto" w:w="0"/>
         <w:jc w:val="center"/>
         <w:tblLook w:firstColumn="1" w:firstRow="1" w:lastColumn="0" w:lastRow="0" w:noHBand="0" w:noVBand="1" w:val="04A0"/>
+        <w:tblBorders>
+          <w:top w:val="single" w:sz="4" w:space="0" w:color="000000"/>
+          <w:left w:val="single" w:sz="4" w:space="0" w:color="000000"/>
+          <w:bottom w:val="single" w:sz="4" w:space="0" w:color="000000"/>
+          <w:right w:val="single" w:sz="4" w:space="0" w:color="000000"/>
+          <w:insideH w:val="single" w:sz="4" w:space="0" w:color="000000"/>
+          <w:insideV w:val="single" w:sz="4" w:space="0" w:color="000000"/>
+        </w:tblBorders>
       </w:tblPr>
       <w:tblGrid>
         <w:gridCol w:w="4536"/>
@@ -520,11 +490,10 @@
         <w:tc>
           <w:tcPr>
             <w:tcW w:type="dxa" w:w="4536"/>
-            <w:shd w:val="clear" w:color="auto" w:fill="1A2F4E"/>
           </w:tcPr>
           <w:p>
             <w:pPr>
-              <w:spacing w:before="80" w:after="80"/>
+              <w:spacing w:before="60" w:after="60"/>
               <w:jc w:val="center"/>
             </w:pPr>
             <w:r>
@@ -532,7 +501,7 @@
                 <w:rFonts w:ascii="TH Sarabun New" w:hAnsi="TH Sarabun New" w:eastAsia="TH Sarabun New"/>
                 <w:b/>
                 <w:i w:val="0"/>
-                <w:color w:val="FFFFFF"/>
+                <w:color w:val="000000"/>
                 <w:sz w:val="24"/>
               </w:rPr>
               <w:t>ขั้นตอนพัฒนา</w:t>
@@ -542,19 +511,18 @@
         <w:tc>
           <w:tcPr>
             <w:tcW w:type="dxa" w:w="4536"/>
-            <w:shd w:val="clear" w:color="auto" w:fill="FFFFFF"/>
           </w:tcPr>
           <w:p>
             <w:pPr>
-              <w:spacing w:before="80" w:after="80"/>
+              <w:spacing w:before="60" w:after="60"/>
             </w:pPr>
             <w:r>
               <w:rPr>
                 <w:rFonts w:ascii="TH Sarabun New" w:hAnsi="TH Sarabun New" w:eastAsia="TH Sarabun New"/>
-                <w:b w:val="0"/>
+                <w:b/>
                 <w:i w:val="0"/>
                 <w:color w:val="000000"/>
-                <w:sz w:val="22"/>
+                <w:sz w:val="24"/>
               </w:rPr>
               <w:t>รายละเอียดกิจกรรม</w:t>
             </w:r>
@@ -565,19 +533,18 @@
         <w:tc>
           <w:tcPr>
             <w:tcW w:type="dxa" w:w="4536"/>
-            <w:shd w:val="clear" w:color="auto" w:fill="C89F2E"/>
           </w:tcPr>
           <w:p>
             <w:pPr>
-              <w:spacing w:before="80" w:after="80"/>
+              <w:spacing w:before="60" w:after="60"/>
               <w:jc w:val="center"/>
             </w:pPr>
             <w:r>
               <w:rPr>
                 <w:rFonts w:ascii="TH Sarabun New" w:hAnsi="TH Sarabun New" w:eastAsia="TH Sarabun New"/>
-                <w:b/>
+                <w:b w:val="0"/>
                 <w:i w:val="0"/>
-                <w:color w:val="FFFFFF"/>
+                <w:color w:val="000000"/>
                 <w:sz w:val="24"/>
               </w:rPr>
               <w:t>P — วางแผน (Plan)</w:t>
@@ -587,11 +554,10 @@
         <w:tc>
           <w:tcPr>
             <w:tcW w:type="dxa" w:w="4536"/>
-            <w:shd w:val="clear" w:color="auto" w:fill="F4F6F9"/>
           </w:tcPr>
           <w:p>
             <w:pPr>
-              <w:spacing w:before="80" w:after="80"/>
+              <w:spacing w:before="60" w:after="60"/>
             </w:pPr>
             <w:r>
               <w:rPr>
@@ -599,7 +565,7 @@
                 <w:b w:val="0"/>
                 <w:i w:val="0"/>
                 <w:color w:val="000000"/>
-                <w:sz w:val="22"/>
+                <w:sz w:val="24"/>
               </w:rPr>
               <w:t>ศึกษาระเบียบชั่วโมงเรียนและคู่มือประกันคุณภาพ ยศ.ทบ. รวบรวมปัญหาตารางซ้อนและครูชนกัน เพื่อเขียนวิเคราะห์โครงสร้างฐานข้อมูล</w:t>
             </w:r>
@@ -610,19 +576,18 @@
         <w:tc>
           <w:tcPr>
             <w:tcW w:type="dxa" w:w="4536"/>
-            <w:shd w:val="clear" w:color="auto" w:fill="C89F2E"/>
           </w:tcPr>
           <w:p>
             <w:pPr>
-              <w:spacing w:before="80" w:after="80"/>
+              <w:spacing w:before="60" w:after="60"/>
               <w:jc w:val="center"/>
             </w:pPr>
             <w:r>
               <w:rPr>
                 <w:rFonts w:ascii="TH Sarabun New" w:hAnsi="TH Sarabun New" w:eastAsia="TH Sarabun New"/>
-                <w:b/>
+                <w:b w:val="0"/>
                 <w:i w:val="0"/>
-                <w:color w:val="FFFFFF"/>
+                <w:color w:val="000000"/>
                 <w:sz w:val="24"/>
               </w:rPr>
               <w:t>D — ปฏิบัติ (Do)</w:t>
@@ -632,11 +597,10 @@
         <w:tc>
           <w:tcPr>
             <w:tcW w:type="dxa" w:w="4536"/>
-            <w:shd w:val="clear" w:color="auto" w:fill="FFFFFF"/>
           </w:tcPr>
           <w:p>
             <w:pPr>
-              <w:spacing w:before="80" w:after="80"/>
+              <w:spacing w:before="60" w:after="60"/>
             </w:pPr>
             <w:r>
               <w:rPr>
@@ -644,7 +608,7 @@
                 <w:b w:val="0"/>
                 <w:i w:val="0"/>
                 <w:color w:val="000000"/>
-                <w:sz w:val="22"/>
+                <w:sz w:val="24"/>
               </w:rPr>
               <w:t>ออกแบบเขียนโปรแกรม HTML/JS/CSS จำลอง localApi และเชื่อมต่อ Firebase Realtime DB, รัน EventSource และพัฒนาความปลอดภัย SHA-256 Hashing</w:t>
             </w:r>
@@ -655,19 +619,18 @@
         <w:tc>
           <w:tcPr>
             <w:tcW w:type="dxa" w:w="4536"/>
-            <w:shd w:val="clear" w:color="auto" w:fill="C89F2E"/>
           </w:tcPr>
           <w:p>
             <w:pPr>
-              <w:spacing w:before="80" w:after="80"/>
+              <w:spacing w:before="60" w:after="60"/>
               <w:jc w:val="center"/>
             </w:pPr>
             <w:r>
               <w:rPr>
                 <w:rFonts w:ascii="TH Sarabun New" w:hAnsi="TH Sarabun New" w:eastAsia="TH Sarabun New"/>
-                <w:b/>
+                <w:b w:val="0"/>
                 <w:i w:val="0"/>
-                <w:color w:val="FFFFFF"/>
+                <w:color w:val="000000"/>
                 <w:sz w:val="24"/>
               </w:rPr>
               <w:t>C — ตรวจสอบ (Check)</w:t>
@@ -677,11 +640,10 @@
         <w:tc>
           <w:tcPr>
             <w:tcW w:type="dxa" w:w="4536"/>
-            <w:shd w:val="clear" w:color="auto" w:fill="F4F6F9"/>
           </w:tcPr>
           <w:p>
             <w:pPr>
-              <w:spacing w:before="80" w:after="80"/>
+              <w:spacing w:before="60" w:after="60"/>
             </w:pPr>
             <w:r>
               <w:rPr>
@@ -689,9 +651,9 @@
                 <w:b w:val="0"/>
                 <w:i w:val="0"/>
                 <w:color w:val="000000"/>
-                <w:sz w:val="22"/>
+                <w:sz w:val="24"/>
               </w:rPr>
-              <w:t>จำลองการตั้งค่าระบบ Firebase Rules และคีย์ Secrets เพื่อทดลองแฮกรหัสผ่านแอดมิน และตรวจสอบความมั่นคงปลอดภัยฐานข้อมูล</w:t>
+              <w:t>จำลองการตั้งค่าระบบ Firebase Rules และคีย์ Secrets เพื่อทดลองแฮกและทดสอบรหัสผ่านบัญชีแอดมิน เพื่อความมั่นคงปลอดภัยฐานข้อมูล</w:t>
             </w:r>
           </w:p>
         </w:tc>
@@ -700,19 +662,18 @@
         <w:tc>
           <w:tcPr>
             <w:tcW w:type="dxa" w:w="4536"/>
-            <w:shd w:val="clear" w:color="auto" w:fill="C89F2E"/>
           </w:tcPr>
           <w:p>
             <w:pPr>
-              <w:spacing w:before="80" w:after="80"/>
+              <w:spacing w:before="60" w:after="60"/>
               <w:jc w:val="center"/>
             </w:pPr>
             <w:r>
               <w:rPr>
                 <w:rFonts w:ascii="TH Sarabun New" w:hAnsi="TH Sarabun New" w:eastAsia="TH Sarabun New"/>
-                <w:b/>
+                <w:b w:val="0"/>
                 <w:i w:val="0"/>
-                <w:color w:val="FFFFFF"/>
+                <w:color w:val="000000"/>
                 <w:sz w:val="24"/>
               </w:rPr>
               <w:t>A — ปรับปรุง (Act)</w:t>
@@ -722,11 +683,10 @@
         <w:tc>
           <w:tcPr>
             <w:tcW w:type="dxa" w:w="4536"/>
-            <w:shd w:val="clear" w:color="auto" w:fill="FFFFFF"/>
           </w:tcPr>
           <w:p>
             <w:pPr>
-              <w:spacing w:before="80" w:after="80"/>
+              <w:spacing w:before="60" w:after="60"/>
             </w:pPr>
             <w:r>
               <w:rPr>
@@ -734,7 +694,7 @@
                 <w:b w:val="0"/>
                 <w:i w:val="0"/>
                 <w:color w:val="000000"/>
-                <w:sz w:val="22"/>
+                <w:sz w:val="24"/>
               </w:rPr>
               <w:t>นำระบบเข้าทดสอบรันจริง ณ โรงเรียนทหารขนส่ง ในหลักสูตร นนส.ขส. รุ่นที่ 27 และสอนใช้งานพร้อมเขียนบันทึกประวัติข้อเสนอแนะเพื่อพัฒนาต่อยอดแอปพลิเคชันออนไลน์</w:t>
             </w:r>
@@ -745,7 +705,7 @@
     <w:p/>
     <w:p>
       <w:pPr>
-        <w:spacing w:before="0" w:after="120" w:line="276" w:lineRule="auto"/>
+        <w:spacing w:before="160" w:after="120" w:line="276" w:lineRule="auto"/>
         <w:jc w:val="left"/>
       </w:pPr>
       <w:r>
@@ -753,7 +713,7 @@
           <w:rFonts w:ascii="TH Sarabun New" w:hAnsi="TH Sarabun New" w:eastAsia="TH Sarabun New"/>
           <w:b/>
           <w:i w:val="0"/>
-          <w:color w:val="1A2F4E"/>
+          <w:color w:val="000000"/>
           <w:sz w:val="30"/>
         </w:rPr>
         <w:t>8. จุดเด่น หรือกลไกการทำงานที่เป็นจุดเด่นที่แตกต่างจากของผู้อื่น</w:t>
@@ -772,16 +732,16 @@
           <w:color w:val="000000"/>
           <w:sz w:val="28"/>
         </w:rPr>
-        <w:t xml:space="preserve">   1)  **ไร้ค่าใช้จ่ายเซิร์ฟเวอร์ (Zero-Server-Hosting Cost)**: ระบบออกแบบโดยใช้สถาปัตยกรรมไร้เซิร์ฟเวอร์ พึ่งพา Firebase Free Tier และ GitHub Pages ทำให้หน่วยงานทหารขนส่งไม่มีภาระค่าเช่าเซิร์ฟเวอร์รายปีในการใช้งานแอปพลิเคชัน</w:t>
+        <w:t xml:space="preserve">   1)  **ไร้ค่าใช้จ่ายเซิร์ฟเวอร์ (Zero-Server-Hosting Cost)**: ระบบออกแบบโดยใช้สถาปัตยกรรมไร้เซิร์ฟเวอร์ พึ่งพา Firebase Free Tier และ GitHub Pages ทำให้ไม่มีภาระค่าเช่าโฮสติ้งเซิร์ฟเวอร์รายปีในการใช้งานแอปพลิเคชัน</w:t>
         <w:br/>
-        <w:t xml:space="preserve">   2)  **ความปลอดภัยข้อมูลส่วนบุคคลฝั่งไคลเอนต์**: การแฮชรหัสผ่านในเบราว์เซอร์ด้วย SHA-256 มั่นใจได้ว่าไม่มีคีย์หรือรหัสผ่านเป็นตัวอักษรธรรมดารั่วไหลสู่คลาวด์ และปิดกั้นสิทธิ์อ่านเขียน Firebase จากบุคคลภายนอกด้วยระบบ Database Secrets Rules</w:t>
+        <w:t xml:space="preserve">   2)  **ความปลอดภัยข้อมูลส่วนบุคคลฝั่งไคลเอนต์**: การแฮชรหัสผ่านในเบราว์เซอร์ด้วย SHA-256 มั่นใจได้ว่าไม่มีคีย์รหัสผ่าน Plaintext รั่วไหลสู่คลาวด์สาธารณะ และปิดกั้นสิทธิ์เขียน Firebase ด้วยระบบ Secrets Rules</w:t>
         <w:br/>
-        <w:t xml:space="preserve">   3)  **ระบบออฟไลน์แคชและสำรองซ้อน**: แม้ไม่มีอินเทอร์เน็ต แอปพลิเคชันยังคงสามารถเปิดตารางเรียนได้และมีข้อมูลผู้ใช้สำรองดึงมาจาก GitHub snapshot data.json ป้องกันความเสียหายกรณีฐานข้อมูลพังได้อย่างมีเสถียรภาพ</w:t>
+        <w:t xml:space="preserve">   3)  **ระบบออฟไลน์แคชและสำรองซ้อน**: แม้ออฟไลน์ยังรันดูตารางสอนได้ และมีตัวสำรอง Snapshot JSON บน GitHub กู้คืนได้ทันทีกรณีระบบคลาวด์หลักเกิดความเสียหาย</w:t>
       </w:r>
     </w:p>
     <w:p>
       <w:pPr>
-        <w:spacing w:before="0" w:after="120" w:line="276" w:lineRule="auto"/>
+        <w:spacing w:before="160" w:after="120" w:line="276" w:lineRule="auto"/>
         <w:jc w:val="left"/>
       </w:pPr>
       <w:r>
@@ -789,7 +749,7 @@
           <w:rFonts w:ascii="TH Sarabun New" w:hAnsi="TH Sarabun New" w:eastAsia="TH Sarabun New"/>
           <w:b/>
           <w:i w:val="0"/>
-          <w:color w:val="1A2F4E"/>
+          <w:color w:val="000000"/>
           <w:sz w:val="30"/>
         </w:rPr>
         <w:t>9. ประโยชน์และคุณค่าของผลงาน</w:t>
@@ -808,11 +768,11 @@
           <w:color w:val="000000"/>
           <w:sz w:val="28"/>
         </w:rPr>
-        <w:t xml:space="preserve">   •  **ต่อสถาบันการศึกษา**: ได้ซอฟต์แวร์กลางในการจัดเก็บตารางสอน ประหยัดเวลากว่าระบบเดิม 5 เท่า ลดปัญหาครูชนกัน 100% ประหยัดค่ากระดาษและเอกสารนำเสนอ</w:t>
+        <w:t xml:space="preserve">   •  **ต่อโรงเรียนขนส่ง**: ได้ระบบตารางเรียนอิเล็กทรอนิกส์กลาง ลดเวลาจัดตารางลง 5 เท่า ป้องกันตารางชน 100% ประหยัดค่าวัสดุกระดาษธุรการ</w:t>
         <w:br/>
-        <w:t xml:space="preserve">   •  **ต่อครูผู้สอน**: สามารถเปิดดูตารางเรียนที่อัพเดทได้ทันทีผ่านมือถือ ลดการประสานงานผิดพลาด และตรวจเช็คภาระชั่วโมงสอนได้แม่นยำ</w:t>
+        <w:t xml:space="preserve">   •  **ต่อครูผู้สอน**: สามารถตรวจสอบและอัพเดทตารางเรียนของตนเองผ่านสมาร์ทโฟนได้รวดเร็วทันที ลดปัญหาการติดต่อประสานงานคลาดเคลื่อน</w:t>
         <w:br/>
-        <w:t xml:space="preserve">   •  **ต่อนักเรียนทหาร**: ทราบตารางการฝึกศึกษาที่แน่นอน วางแผนเตรียมเครื่องแต่งกายและการฝึกได้ตรงเวลา ช่วยยกระดับประสิทธิภาพการฝึกอบรม</w:t>
+        <w:t xml:space="preserve">   •  **ต่อนักเรียนทหาร**: ทราบตารางเรียนที่แน่นอน ล่วงหน้าและทันท่วงที ช่วยส่งเสริมประสิทธิภาพและระบบเตรียมความพร้อมศึกษา</w:t>
       </w:r>
     </w:p>
     <w:p/>

</xml_diff>

<commit_message>
Format word documents with Justify alignment and Thai ZWSP word tokenization using PyThaiNLP
</commit_message>
<xml_diff>
--- a/docs/01_educational_innovation_proposal_timetable.docx
+++ b/docs/01_educational_innovation_proposal_timetable.docx
@@ -15,7 +15,7 @@
           <w:color w:val="000000"/>
           <w:sz w:val="36"/>
         </w:rPr>
-        <w:t>บันทึกข้อความ</w:t>
+        <w:t>บันทึก​ข้อความ</w:t>
       </w:r>
     </w:p>
     <w:tbl>
@@ -42,7 +42,7 @@
                 <w:color w:val="000000"/>
                 <w:sz w:val="28"/>
               </w:rPr>
-              <w:t>ส่วนราชการ  กศ.รร.ขส.ขส.ทบ. (โทร. ๕๒๒๗๒)</w:t>
+              <w:t>ส่วนราชการ  ก​ศ.​รร.​ขส.ขส.ทบ. (โท​ร. ๕๒๒๗๒)</w:t>
             </w:r>
           </w:p>
         </w:tc>
@@ -59,7 +59,7 @@
                 <w:color w:val="000000"/>
                 <w:sz w:val="28"/>
               </w:rPr>
-              <w:t>โทร. ๕๒๒๗๒</w:t>
+              <w:t>โท​ร. ๕๒๒๗๒</w:t>
             </w:r>
           </w:p>
         </w:tc>
@@ -114,7 +114,7 @@
                 <w:color w:val="000000"/>
                 <w:sz w:val="28"/>
               </w:rPr>
-              <w:t>เรื่อง  ขอส่งผลงานนวัตกรรมด้านการศึกษาเข้าร่วมประกวด ประจำปี ๒๕๖๗</w:t>
+              <w:t>เรื่อง  ขอ​ส่ง​ผลงาน​นวัตกรรม​ด้าน​การศึกษา​เข้าร่วม​ประกวด ประจำปี ๒๕๖๗</w:t>
             </w:r>
           </w:p>
         </w:tc>
@@ -130,7 +130,7 @@
     <w:p>
       <w:pPr>
         <w:spacing w:before="0" w:after="120" w:line="276" w:lineRule="auto"/>
-        <w:jc w:val="left"/>
+        <w:jc w:val="both"/>
       </w:pPr>
       <w:r>
         <w:rPr>
@@ -140,13 +140,13 @@
           <w:color w:val="000000"/>
           <w:sz w:val="28"/>
         </w:rPr>
-        <w:t>เรียน  ผบ.รร.ขส.ขส.ทบ. (ผ่าน ผตก.รร.ขส.ขส.ทบ.)</w:t>
+        <w:t>เรียน  ผบ.​รร.​ขส.ขส.ทบ. (ผ่าน ผต​ก.​รร.​ขส.ขส.ทบ.)</w:t>
       </w:r>
     </w:p>
     <w:p>
       <w:pPr>
         <w:spacing w:before="0" w:after="120" w:line="276" w:lineRule="auto"/>
-        <w:jc w:val="left"/>
+        <w:jc w:val="both"/>
       </w:pPr>
       <w:r>
         <w:rPr>
@@ -156,10 +156,10 @@
           <w:color w:val="000000"/>
           <w:sz w:val="28"/>
         </w:rPr>
-        <w:t>ตามอ้างถึงกองการศึกษา สพ.ศท.ยศ.ทบ. ขอเชิญส่งผลงานวิชาการเข้าร่วมประกวด ประจำปีงบประมาณ ๒๕๖๗ กองการศึกษา โรงเรียนทหารขนส่ง ขอส่งผลงานนวัตกรรมด้านการศึกษาในหัวข้อ 'ระบบตารางสอนประจำสัปดาห์แบบประสานข้อมูลเรียลไทม์และสำรองข้อมูลอัตโนมัติ' ซึ่งเป็นสิ่งประดิษฐ์ซอฟต์แวร์ประยุกต์บริหารสถาบันศึกษา พัฒนาขึ้นโดย พ.ต.ณัฐพล พัฒนกุล โดยได้ดำเนินการลงทะเบียนในระบบเป็นที่เรียบร้อย รายละเอียดตามสิ่งที่ส่งมาด้วยนี้</w:t>
+        <w:t>ตาม​อ้าง​ถึง​กอง​การศึกษา สพ.ศท.ยศ.ทบ. ขอ​เชิญ​ส่งผล​งานวิชาการ​เข้าร่วม​ประกวด ประจำ​ปีงบประมาณ ๒๕๖๗ กอง​การศึกษา โรงเรียน​ทหาร​ขนส่ง ขอ​ส่ง​ผลงาน​นวัตกรรม​ด้าน​การศึกษา​ใน​หัวข้อ 'ระบบ​ตารางสอน​ประจำสัปดาห์​แบบ​ประสาน​ข้อมูล​เรียลไทม์​และ​สำรอง​ข้อมูล​อัตโนมัติ' ซึ่ง​เป็น​สิ่งประดิษฐ์​ซอฟต์แวร์​ประยุกต์​บริหาร​สถาบัน​ศึกษา พัฒนา​ขึ้น​โดย พ.ต.​ณัฐพล พัฒน​กุล โดย​ได้​ดำเนินการ​ลงทะเบียน​ใน​ระบบ​เป็นที่​เรียบร้อย รายละเอียด​ตาม​สิ่ง​ที่​ส่ง​มา​ด้วย​นี้</w:t>
         <w:br/>
         <w:br/>
-        <w:t>จึงเรียนมาเพื่อกรุณาทราบและพิจารณาดำเนินการต่อไป</w:t>
+        <w:t>จึง​เรียน​มา​เพื่อ​กรุณา​ทราบ​และ​พิจารณา​ดำเนินการ​ต่อไป</w:t>
       </w:r>
     </w:p>
     <w:p>
@@ -186,7 +186,7 @@
           <w:color w:val="000000"/>
           <w:sz w:val="28"/>
         </w:rPr>
-        <w:t>( วสันต์ วราสินธุ์ )</w:t>
+        <w:t>( วสันต์ ว​รา​สินธุ์ )</w:t>
         <w:br/>
       </w:r>
       <w:r>
@@ -197,7 +197,7 @@
           <w:color w:val="000000"/>
           <w:sz w:val="26"/>
         </w:rPr>
-        <w:t>ผอ.กศ.รร.ขส.ขส.ทบ.</w:t>
+        <w:t>ผอ.​ก​ศ.​รร.​ขส.ขส.ทบ.</w:t>
       </w:r>
     </w:p>
     <w:p>
@@ -218,7 +218,7 @@
           <w:color w:val="000000"/>
           <w:sz w:val="32"/>
         </w:rPr>
-        <w:t>แบบเสนอผลงานวิชาการด้านการศึกษา</w:t>
+        <w:t>แบบ​เสนอ​ผล​งานวิชาการ​ด้าน​การศึกษา</w:t>
         <w:br/>
       </w:r>
       <w:r>
@@ -229,7 +229,7 @@
           <w:color w:val="000000"/>
           <w:sz w:val="28"/>
         </w:rPr>
-        <w:t>เข้าร่วมงานประชุมวิชาการและสรุปผลการพัฒนาคุณภาพการศึกษา ประจำปี ๒๕๖๗</w:t>
+        <w:t>เข้า​ร่วมงาน​ประชุม​วิชาการ​และ​สรุป​ผล​การพัฒนา​คุณภาพ​การศึกษา ประจำปี ๒๕๖๗</w:t>
         <w:br/>
       </w:r>
       <w:r>
@@ -240,14 +240,14 @@
           <w:color w:val="000000"/>
           <w:sz w:val="28"/>
         </w:rPr>
-        <w:t>สำนักการศึกษา กรมยุทธศึกษาทหารบก</w:t>
+        <w:t>สำ​นักการศึกษา กรม​ยุทธ​ศึกษา​ทหารบก</w:t>
       </w:r>
     </w:p>
     <w:p/>
     <w:p>
       <w:pPr>
         <w:spacing w:before="160" w:after="120" w:line="276" w:lineRule="auto"/>
-        <w:jc w:val="left"/>
+        <w:jc w:val="both"/>
       </w:pPr>
       <w:r>
         <w:rPr>
@@ -257,13 +257,13 @@
           <w:color w:val="000000"/>
           <w:sz w:val="30"/>
         </w:rPr>
-        <w:t>1. ชื่อผลงานวิชาการด้านการศึกษา</w:t>
+        <w:t>1. ชื่อ​ผล​งานวิชาการ​ด้าน​การศึกษา</w:t>
       </w:r>
     </w:p>
     <w:p>
       <w:pPr>
         <w:spacing w:before="0" w:after="120" w:line="276" w:lineRule="auto"/>
-        <w:jc w:val="left"/>
+        <w:jc w:val="both"/>
       </w:pPr>
       <w:r>
         <w:rPr>
@@ -273,17 +273,17 @@
           <w:color w:val="000000"/>
           <w:sz w:val="28"/>
         </w:rPr>
-        <w:t xml:space="preserve">   •  ชื่อภาษาไทย: ระบบจัดการตารางสอนประจำสัปดาห์แบบประสานข้อมูลเรียลไทม์และสำรองข้อมูลอัตโนมัติ</w:t>
+        <w:t xml:space="preserve">   •  ชื่อ​ภาษาไทย: ระบบ​จัดการ​ตารางสอน​ประจำสัปดาห์​แบบ​ประสาน​ข้อมูล​เรียลไทม์​และ​สำรอง​ข้อมูล​อัตโนมัติ</w:t>
         <w:br/>
-        <w:t xml:space="preserve">   •  ชื่อภาษาอังกฤษ: Weekly Timetable Management System with Real-Time Cloud Sync &amp; Automated Backup</w:t>
+        <w:t xml:space="preserve">   •  ชื่อ​ภาษาอังกฤษ: Weekly Timetable Management System with Real-Time Cloud Sync &amp; Automated Backup</w:t>
         <w:br/>
-        <w:t xml:space="preserve">   •  ประเภทนวัตกรรม: นวัตกรรมสิ่งประดิษฐ์ทางด้านการศึกษา / ระบบบริการจัดการสถานศึกษาดิจิทัล</w:t>
+        <w:t xml:space="preserve">   •  ประเภท​นวัตกรรม: นวัตกรรม​สิ่งประดิษฐ์​ทาง​ด้าน​การศึกษา / ระบบ​บริการ​จัดการ​สถานศึกษา​ดิจิทัล</w:t>
       </w:r>
     </w:p>
     <w:p>
       <w:pPr>
         <w:spacing w:before="160" w:after="120" w:line="276" w:lineRule="auto"/>
-        <w:jc w:val="left"/>
+        <w:jc w:val="both"/>
       </w:pPr>
       <w:r>
         <w:rPr>
@@ -293,13 +293,13 @@
           <w:color w:val="000000"/>
           <w:sz w:val="30"/>
         </w:rPr>
-        <w:t>2. รายชื่อคณะผู้จัดทำ</w:t>
+        <w:t>2. รายชื่อ​คณะ​ผู้จัดทำ</w:t>
       </w:r>
     </w:p>
     <w:p>
       <w:pPr>
         <w:spacing w:before="0" w:after="120" w:line="276" w:lineRule="auto"/>
-        <w:jc w:val="left"/>
+        <w:jc w:val="both"/>
       </w:pPr>
       <w:r>
         <w:rPr>
@@ -309,15 +309,15 @@
           <w:color w:val="000000"/>
           <w:sz w:val="28"/>
         </w:rPr>
-        <w:t xml:space="preserve">   พ.ต. ณัฐพล พัฒนกุล (อาจารย์ โรงเรียนทหารขนส่ง กรมการขนส่งทหารบก)</w:t>
+        <w:t xml:space="preserve">   พ.ต. ณัฐพล พัฒน​กุล (อาจารย์ โรงเรียน​ทหาร​ขนส่ง กรม​การขนส่ง​ทหารบก)</w:t>
         <w:br/>
-        <w:t xml:space="preserve">   อีเมล: nattapon.ats01@gmail.com   โทรศัพท์: 090-924-2555</w:t>
+        <w:t xml:space="preserve">   อีเมล: nattapon​.ats01@gmail.com   โทรศัพท์: 090-924-2555</w:t>
       </w:r>
     </w:p>
     <w:p>
       <w:pPr>
         <w:spacing w:before="160" w:after="120" w:line="276" w:lineRule="auto"/>
-        <w:jc w:val="left"/>
+        <w:jc w:val="both"/>
       </w:pPr>
       <w:r>
         <w:rPr>
@@ -327,13 +327,13 @@
           <w:color w:val="000000"/>
           <w:sz w:val="30"/>
         </w:rPr>
-        <w:t>3. สถานศึกษา/สถาบันการศึกษาที่สังกัด</w:t>
+        <w:t>3. สถานศึกษา/สถาบันการศึกษา​ที่​สังกัด</w:t>
       </w:r>
     </w:p>
     <w:p>
       <w:pPr>
         <w:spacing w:before="0" w:after="120" w:line="276" w:lineRule="auto"/>
-        <w:jc w:val="left"/>
+        <w:jc w:val="both"/>
       </w:pPr>
       <w:r>
         <w:rPr>
@@ -343,13 +343,13 @@
           <w:color w:val="000000"/>
           <w:sz w:val="28"/>
         </w:rPr>
-        <w:t xml:space="preserve">   โรงเรียนทหารขนส่ง กรมการขนส่งทหารบก</w:t>
+        <w:t xml:space="preserve">   โรงเรียน​ทหาร​ขนส่ง กรม​การขนส่ง​ทหารบก</w:t>
       </w:r>
     </w:p>
     <w:p>
       <w:pPr>
         <w:spacing w:before="160" w:after="120" w:line="276" w:lineRule="auto"/>
-        <w:jc w:val="left"/>
+        <w:jc w:val="both"/>
       </w:pPr>
       <w:r>
         <w:rPr>
@@ -359,13 +359,13 @@
           <w:color w:val="000000"/>
           <w:sz w:val="30"/>
         </w:rPr>
-        <w:t>4. ที่มาของแนวคิดในการพัฒนาผลงานวิชาการด้านการศึกษา</w:t>
+        <w:t>4. ที่มา​ของ​แนวคิด​ใน​การพัฒนา​ผล​งานวิชาการ​ด้าน​การศึกษา</w:t>
       </w:r>
     </w:p>
     <w:p>
       <w:pPr>
         <w:spacing w:before="0" w:after="120" w:line="276" w:lineRule="auto"/>
-        <w:jc w:val="left"/>
+        <w:jc w:val="both"/>
       </w:pPr>
       <w:r>
         <w:rPr>
@@ -375,13 +375,13 @@
           <w:color w:val="000000"/>
           <w:sz w:val="28"/>
         </w:rPr>
-        <w:t>หลักสูตรเรียนของโรงเรียนทหารขนส่ง กรมการขนส่งทหารบก มักมีการปรับแผนและเปลี่ยนวิชาสอนกะทันหันบ่อยครั้งเนื่องจากภารกิจทหาร ทำให้ตารางสอนกระดาษหรือ Excel เดิมต้องแก้ใหม่รายสัปดาห์ ข้อมูลเวลาเรียนและผู้ตรวจอนุมัติสะสมชั่วโมงไม่ตรงกัน ทำให้เกิดความล่าช้าในการเผยแพร่และตารางเรียนชนกัน ซึ่งขัดต่อมาตรฐานคุณภาพการเรียนรู้ ยศ.ทบ. พ.ศ. 2566 – 2570 ดังนั้น กองการศึกษา รร.ขส.ขส.ทบ. จึงเห็นควรพัฒนา 'ระบบตารางสอนประจำสัปดาห์แบบเรียลไทม์' ซึ่งโฮสต์ฟรีแบบออฟไลน์และออนไลน์พร้อมสตรีมเหตุการณ์ซิงค์ข้อมูลผ่าน Google Firebase และ GitHub Pages อัตโนมัติ นวัตกรรมนี้นอกจากจะคำนวณชั่วโมงสะสมถูกต้องรวดเร็วแล้ว ยังรักษาความปลอดภัยข้อมูลรหัสผ่านแอดมินด้วย SHA-256 Hashing ฝั่งไคลเอนต์</w:t>
+        <w:t>หลักสูตร​เรียน​ของ​โรงเรียน​ทหาร​ขนส่ง กรม​การขนส่ง​ทหารบก มัก​มี​การ​ปรับ​แผน​และ​เปลี่ยน​วิชา​สอน​กะทันหัน​บ่อยครั้ง​เนื่องจาก​ภารกิจ​ทหาร ทำให้​ตารางสอน​กระดาษ​หรือ Excel เดิม​ต้อง​แก้​ใหม่​รายสัปดาห์ ข้อมูล​เวลาเรียน​และ​ผู้ตรวจ​อนุมัติ​สะสม​ชั่วโมง​ไม่​ตรงกัน ทำให้เกิด​ความล่าช้า​ใน​การ​เผยแพร่​และ​ตารางเรียน​ชน​กัน ซึ่ง​ขัดต่อ​มาตรฐาน​คุณภาพ​การเรียนรู้ ยศ.ทบ. พ.ศ. 2566 – 2570 ดังนั้น กอง​การศึกษา รร.​ขส.ขส.ทบ. จึง​เห็นควร​พัฒนา 'ระบบ​ตารางสอน​ประจำสัปดาห์​แบบ​เรียลไทม์' ซึ่ง​โฮสต์​ฟรี​แบบ​ออฟไลน์​และ​ออนไลน์​พร้อม​สตรีม​เหตุการณ์​ซิงค์​ข้อมูล​ผ่าน Google Firebase และ GitHub Pages อัตโนมัติ นวัตกรรม​นี้​นอกจาก​จะ​คำนวณ​ชั่วโมง​สะสม​ถูกต้อง​รวดเร็ว​แล้ว ยัง​รักษา​ความปลอดภัย​ข้อมูล​รหัสผ่าน​แอดมิน​ด้วย SHA-​256 Hashing ฝั่ง​ไคลเอนต์</w:t>
       </w:r>
     </w:p>
     <w:p>
       <w:pPr>
         <w:spacing w:before="160" w:after="120" w:line="276" w:lineRule="auto"/>
-        <w:jc w:val="left"/>
+        <w:jc w:val="both"/>
       </w:pPr>
       <w:r>
         <w:rPr>
@@ -397,7 +397,7 @@
     <w:p>
       <w:pPr>
         <w:spacing w:before="0" w:after="120" w:line="276" w:lineRule="auto"/>
-        <w:jc w:val="left"/>
+        <w:jc w:val="both"/>
       </w:pPr>
       <w:r>
         <w:rPr>
@@ -407,17 +407,17 @@
           <w:color w:val="000000"/>
           <w:sz w:val="28"/>
         </w:rPr>
-        <w:t xml:space="preserve">   1. เพื่อพัฒนาระบบซอฟต์แวร์จัดการตารางเรียนเรียลไทม์คลาวด์ ป้องกันตารางชนและคำนวณชั่วโมงสะสมวิชาเรียนถูกต้อง 100%</w:t>
+        <w:t xml:space="preserve">   1. เพื่อ​พัฒนา​ระบบ​ซอฟต์แวร์​จัดการ​ตารางเรียน​เรียลไทม์​คลาวด์ ป้องกัน​ตาราง​ชน​และ​คำนวณ​ชั่วโมง​สะสม​วิชา​เรียน​ถูกต้อง 100​%</w:t>
         <w:br/>
-        <w:t xml:space="preserve">   2. เพื่อรักษาความปลอดภัยข้อมูลและควบคุมสิทธิ์การเข้าถึงฐานข้อมูล Firebase ด้วย Database Secrets และ SHA-256 Hashing</w:t>
+        <w:t xml:space="preserve">   2. เพื่อ​รักษา​ความปลอดภัย​ข้อมูล​และ​ควบคุม​สิทธิ์​การ​เข้าถึง​ฐานข้อมูล Firebase ด้วย Database Secrets และ SHA-​256 Hashing</w:t>
         <w:br/>
-        <w:t xml:space="preserve">   3. เพื่อเพิ่มความพึงพอใจการเข้าถึงข้อมูลตารางเรียนครูและนักเรียนผ่านสมาร์ทโฟน</w:t>
+        <w:t xml:space="preserve">   3. เพื่อ​เพิ่ม​ความพึงพอใจ​การ​เข้าถึง​ข้อมูล​ตารางเรียน​ครู​และ​นักเรียน​ผ่าน​สมาร์ท​โฟน</w:t>
       </w:r>
     </w:p>
     <w:p>
       <w:pPr>
         <w:spacing w:before="160" w:after="120" w:line="276" w:lineRule="auto"/>
-        <w:jc w:val="left"/>
+        <w:jc w:val="both"/>
       </w:pPr>
       <w:r>
         <w:rPr>
@@ -427,13 +427,13 @@
           <w:color w:val="000000"/>
           <w:sz w:val="30"/>
         </w:rPr>
-        <w:t>6. คุณสมบัติ/คุณลักษณะเฉพาะและขอบเขตการใช้งานของผลงาน</w:t>
+        <w:t>6. คุณสมบัติ/คุณ​ลักษณะเฉพาะ​และ​ขอบเขต​การใช้งาน​ของ​ผลงาน</w:t>
       </w:r>
     </w:p>
     <w:p>
       <w:pPr>
         <w:spacing w:before="0" w:after="120" w:line="276" w:lineRule="auto"/>
-        <w:jc w:val="left"/>
+        <w:jc w:val="both"/>
       </w:pPr>
       <w:r>
         <w:rPr>
@@ -443,19 +443,19 @@
           <w:color w:val="000000"/>
           <w:sz w:val="28"/>
         </w:rPr>
-        <w:t xml:space="preserve">   •  เป็นซอฟต์แวร์ Single Page Application (SPA) ทำงานได้รวดเร็ว โครงสร้างหน้าจอไม่ซับซ้อน ไฟล์ขนาดเบามาก</w:t>
+        <w:t xml:space="preserve">   •  เป็น​ซอฟต์แวร์ Single Page Application (SPA) ทำงาน​ได้​รวดเร็ว โครงสร้าง​หน้าจอ​ไม่​ซับซ้อน ไฟล์​ขนาด​เบา​มาก</w:t>
         <w:br/>
-        <w:t xml:space="preserve">   •  การแฮชรหัสผ่าน: เข้ารหัสผ่านบัญชีฝั่งเบราว์เซอร์ด้วย SHA-256 และส่ง REST API คู่กับ Database Secrets จำกัดสิทธิ์คลาวด์</w:t>
+        <w:t xml:space="preserve">   •  การ​แฮ​ชร​หัส​ผ่าน: เข้า​รหัสผ่าน​บัญชี​ฝั่ง​เบราว์เซอร์​ด้วย SHA-​256 และ​ส่ง REST API คู่​กับ Database Secrets จำกัด​สิทธิ์​คลาวด์</w:t>
         <w:br/>
-        <w:t xml:space="preserve">   •  ระบบซิงค์เรียลไทม์: เทคโนโลยี Server-Sent Events (SSE) คลาส EventSource ช่วยให้เครื่องแอดมินอัพเดทตารางร่วมกันเรียลไทม์</w:t>
+        <w:t xml:space="preserve">   •  ระบบ​ซิงค์​เรียลไทม์: เทคโนโลยี Server-Sent Events (SSE) คลาส EventSource ช่วย​ให้​เครื่อง​แอดมิน​อัพเดท​ตาราง​ร่วมกัน​เรียลไทม์</w:t>
         <w:br/>
-        <w:t xml:space="preserve">   •  ขอบเขตการทำงาน: บริหารชื่อโรงเรียน, ครูอาจารย์, วิชาเรียนสะสม, ห้องเรียน, วันหยุดเรียน และปุ่มพิมพ์ A4 เลขไทย</w:t>
+        <w:t xml:space="preserve">   •  ขอบเขต​การทำงาน: บริหาร​ชื่อ​โรงเรียน, ครู​อาจารย์, วิชา​เรียน​สะสม, ห้องเรียน, วันหยุด​เรียน และ​ปุ่ม​พิมพ์ A​4 เลข​ไทย</w:t>
       </w:r>
     </w:p>
     <w:p>
       <w:pPr>
         <w:spacing w:before="160" w:after="120" w:line="276" w:lineRule="auto"/>
-        <w:jc w:val="left"/>
+        <w:jc w:val="both"/>
       </w:pPr>
       <w:r>
         <w:rPr>
@@ -465,7 +465,7 @@
           <w:color w:val="000000"/>
           <w:sz w:val="30"/>
         </w:rPr>
-        <w:t>7. หลักการ วิธีการ และขั้นตอนการทำงานของผลงาน</w:t>
+        <w:t>7. หลักการ วิธีการ และ​ขั้นตอน​การทำงาน​ของ​ผลงาน</w:t>
       </w:r>
     </w:p>
     <w:tbl>
@@ -504,7 +504,7 @@
                 <w:color w:val="000000"/>
                 <w:sz w:val="24"/>
               </w:rPr>
-              <w:t>ขั้นตอนพัฒนา</w:t>
+              <w:t>ขั้นตอน​พัฒนา</w:t>
             </w:r>
           </w:p>
         </w:tc>
@@ -524,7 +524,7 @@
                 <w:color w:val="000000"/>
                 <w:sz w:val="24"/>
               </w:rPr>
-              <w:t>รายละเอียดกิจกรรม</w:t>
+              <w:t>รายละเอียด​กิจกรรม</w:t>
             </w:r>
           </w:p>
         </w:tc>
@@ -567,7 +567,7 @@
                 <w:color w:val="000000"/>
                 <w:sz w:val="24"/>
               </w:rPr>
-              <w:t>ศึกษาระเบียบชั่วโมงเรียนและคู่มือประกันคุณภาพ ยศ.ทบ. รวบรวมปัญหาตารางซ้อนและครูชนกัน เพื่อเขียนวิเคราะห์โครงสร้างฐานข้อมูล</w:t>
+              <w:t>ศึกษา​ระเบียบ​ชั่วโมง​เรียน​และ​คู่มือ​ประกัน​คุณภาพ ยศ.ทบ. รวบรวม​ปัญหา​ตาราง​ซ้อน​และ​ครู​ชน​กัน เพื่อ​เขียน​วิเคราะห์​โครงสร้าง​ฐานข้อมูล</w:t>
             </w:r>
           </w:p>
         </w:tc>
@@ -610,7 +610,7 @@
                 <w:color w:val="000000"/>
                 <w:sz w:val="24"/>
               </w:rPr>
-              <w:t>ออกแบบเขียนโปรแกรม HTML/JS/CSS จำลอง localApi และเชื่อมต่อ Firebase Realtime DB, รัน EventSource และพัฒนาความปลอดภัย SHA-256 Hashing</w:t>
+              <w:t>ออกแบบ​เขียน​โปรแกรม HTML​/JS/CSS จำลอง localApi และ​เชื่อมต่อ Firebase Realtime DB, รัน EventSource และ​พัฒนา​ความปลอดภัย SHA-​256 Hashing</w:t>
             </w:r>
           </w:p>
         </w:tc>
@@ -653,7 +653,7 @@
                 <w:color w:val="000000"/>
                 <w:sz w:val="24"/>
               </w:rPr>
-              <w:t>จำลองการตั้งค่าระบบ Firebase Rules และคีย์ Secrets เพื่อทดลองแฮกและทดสอบรหัสผ่านบัญชีแอดมิน เพื่อความมั่นคงปลอดภัยฐานข้อมูล</w:t>
+              <w:t>จำลอง​การ​ตั้งค่า​ระบบ Firebase Rules และ​คีย์ Secrets เพื่อ​ทดลอง​แฮก​และ​ทดสอบ​รหัสผ่าน​บัญชี​แอดมิน เพื่อ​ความมั่นคง​ปลอดภัย​ฐานข้อมูล</w:t>
             </w:r>
           </w:p>
         </w:tc>
@@ -696,7 +696,7 @@
                 <w:color w:val="000000"/>
                 <w:sz w:val="24"/>
               </w:rPr>
-              <w:t>นำระบบเข้าทดสอบรันจริง ณ โรงเรียนทหารขนส่ง ในหลักสูตร นนส.ขส. รุ่นที่ 27 และสอนใช้งานพร้อมเขียนบันทึกประวัติข้อเสนอแนะเพื่อพัฒนาต่อยอดแอปพลิเคชันออนไลน์</w:t>
+              <w:t>นำ​ระบบ​เข้า​ทดสอบ​รัน​จริง ณ โรงเรียน​ทหาร​ขนส่ง ใน​หลักสูตร นนส.ขส. รุ่น​ที่ 27 และ​สอน​ใช้งาน​พร้อม​เขียน​บันทึก​ประวัติ​ข้อเสนอแนะ​เพื่อ​พัฒนา​ต่อยอด​แอปพลิเคชัน​ออนไลน์</w:t>
             </w:r>
           </w:p>
         </w:tc>
@@ -706,7 +706,7 @@
     <w:p>
       <w:pPr>
         <w:spacing w:before="160" w:after="120" w:line="276" w:lineRule="auto"/>
-        <w:jc w:val="left"/>
+        <w:jc w:val="both"/>
       </w:pPr>
       <w:r>
         <w:rPr>
@@ -716,13 +716,13 @@
           <w:color w:val="000000"/>
           <w:sz w:val="30"/>
         </w:rPr>
-        <w:t>8. จุดเด่น หรือกลไกการทำงานที่เป็นจุดเด่นที่แตกต่างจากของผู้อื่น</w:t>
+        <w:t>8. จุดเด่น หรือ​กลไก​การทำงาน​ที่​เป็น​จุดเด่น​ที่​แตกต่าง​จาก​ของ​ผู้อื่น</w:t>
       </w:r>
     </w:p>
     <w:p>
       <w:pPr>
         <w:spacing w:before="0" w:after="120" w:line="276" w:lineRule="auto"/>
-        <w:jc w:val="left"/>
+        <w:jc w:val="both"/>
       </w:pPr>
       <w:r>
         <w:rPr>
@@ -732,17 +732,17 @@
           <w:color w:val="000000"/>
           <w:sz w:val="28"/>
         </w:rPr>
-        <w:t xml:space="preserve">   1)  **ไร้ค่าใช้จ่ายเซิร์ฟเวอร์ (Zero-Server-Hosting Cost)**: ระบบออกแบบโดยใช้สถาปัตยกรรมไร้เซิร์ฟเวอร์ พึ่งพา Firebase Free Tier และ GitHub Pages ทำให้ไม่มีภาระค่าเช่าโฮสติ้งเซิร์ฟเวอร์รายปีในการใช้งานแอปพลิเคชัน</w:t>
+        <w:t xml:space="preserve">   1)  **​ไร้​ค่าใช้จ่าย​เซิร์ฟเวอร์ (Zero-Server-Hosting Cost​)**: ระบบ​ออกแบบ​โดย​ใช้​สถาปัตยกรรม​ไร้​เซิร์ฟเวอร์ พึ่งพา Firebase Free Tier และ GitHub Pages ทำให้​ไม่​มี​ภาระ​ค่าเช่า​โฮ​สติ้ง​เซิร์ฟเวอร์​รายปี​ใน​การใช้งาน​แอปพลิเคชัน</w:t>
         <w:br/>
-        <w:t xml:space="preserve">   2)  **ความปลอดภัยข้อมูลส่วนบุคคลฝั่งไคลเอนต์**: การแฮชรหัสผ่านในเบราว์เซอร์ด้วย SHA-256 มั่นใจได้ว่าไม่มีคีย์รหัสผ่าน Plaintext รั่วไหลสู่คลาวด์สาธารณะ และปิดกั้นสิทธิ์เขียน Firebase ด้วยระบบ Secrets Rules</w:t>
+        <w:t xml:space="preserve">   2)  **​ความปลอดภัย​ข้อมูล​ส่วนบุคคล​ฝั่ง​ไคลเอนต์​**: การ​แฮ​ชร​หัส​ผ่าน​ใน​เบราว์เซอร์​ด้วย SHA-​256 มั่นใจ​ได้​ว่า​ไม่​มี​คีย์​รหัสผ่าน Plaintext รั่วไหล​สู่​คลาวด์​สาธารณะ และ​ปิดกั้น​สิทธิ์​เขียน Firebase ด้วย​ระบบ Secrets Rules</w:t>
         <w:br/>
-        <w:t xml:space="preserve">   3)  **ระบบออฟไลน์แคชและสำรองซ้อน**: แม้ออฟไลน์ยังรันดูตารางสอนได้ และมีตัวสำรอง Snapshot JSON บน GitHub กู้คืนได้ทันทีกรณีระบบคลาวด์หลักเกิดความเสียหาย</w:t>
+        <w:t xml:space="preserve">   3)  **​ระบบ​ออฟไลน์​แคช​และ​สำรอง​ซ้อน​**: แม้​ออฟไลน์​ยัง​รัน​ดู​ตารางสอน​ได้ และ​มี​ตัวสำรอง Snapshot JSON บน GitHub กู้​คืน​ได้​ทันที​กรณี​ระบบ​คลาวด์​หลัก​เกิด​ความเสียหาย</w:t>
       </w:r>
     </w:p>
     <w:p>
       <w:pPr>
         <w:spacing w:before="160" w:after="120" w:line="276" w:lineRule="auto"/>
-        <w:jc w:val="left"/>
+        <w:jc w:val="both"/>
       </w:pPr>
       <w:r>
         <w:rPr>
@@ -752,13 +752,13 @@
           <w:color w:val="000000"/>
           <w:sz w:val="30"/>
         </w:rPr>
-        <w:t>9. ประโยชน์และคุณค่าของผลงาน</w:t>
+        <w:t>9. ประโยชน์​และ​คุณค่า​ของ​ผลงาน</w:t>
       </w:r>
     </w:p>
     <w:p>
       <w:pPr>
         <w:spacing w:before="0" w:after="120" w:line="276" w:lineRule="auto"/>
-        <w:jc w:val="left"/>
+        <w:jc w:val="both"/>
       </w:pPr>
       <w:r>
         <w:rPr>
@@ -768,11 +768,11 @@
           <w:color w:val="000000"/>
           <w:sz w:val="28"/>
         </w:rPr>
-        <w:t xml:space="preserve">   •  **ต่อโรงเรียนขนส่ง**: ได้ระบบตารางเรียนอิเล็กทรอนิกส์กลาง ลดเวลาจัดตารางลง 5 เท่า ป้องกันตารางชน 100% ประหยัดค่าวัสดุกระดาษธุรการ</w:t>
+        <w:t xml:space="preserve">   •  **​ต่อ​โรงเรียน​ขนส่ง​**: ได้​ระบบ​ตารางเรียน​อิเล็กทรอนิกส์​กลาง ลด​เวลา​จัด​ตาราง​ลง 5 เท่า ป้องกัน​ตาราง​ชน 100​% ประหยัด​ค่า​วัสดุ​กระดาษ​ธุรการ</w:t>
         <w:br/>
-        <w:t xml:space="preserve">   •  **ต่อครูผู้สอน**: สามารถตรวจสอบและอัพเดทตารางเรียนของตนเองผ่านสมาร์ทโฟนได้รวดเร็วทันที ลดปัญหาการติดต่อประสานงานคลาดเคลื่อน</w:t>
+        <w:t xml:space="preserve">   •  **​ต่อ​ครูผู้สอน​**: สามารถ​ตรวจสอบ​และ​อัพเดท​ตารางเรียน​ของ​ตนเอง​ผ่าน​สมาร์ท​โฟน​ได้​รวดเร็ว​ทันที ลด​ปัญหา​การ​ติดต่อ​ประสานงาน​คลาดเคลื่อน</w:t>
         <w:br/>
-        <w:t xml:space="preserve">   •  **ต่อนักเรียนทหาร**: ทราบตารางเรียนที่แน่นอน ล่วงหน้าและทันท่วงที ช่วยส่งเสริมประสิทธิภาพและระบบเตรียมความพร้อมศึกษา</w:t>
+        <w:t xml:space="preserve">   •  **​ต่อ​นักเรียน​ทหาร​**: ทราบ​ตารางเรียน​ที่​แน่นอน ล่วงหน้า​และ​ทันท่วงที ช่วย​ส่งเสริม​ประสิทธิภาพ​และ​ระบบ​เตรียม​ความพร้อม​ศึกษา</w:t>
       </w:r>
     </w:p>
     <w:p/>
@@ -803,7 +803,7 @@
                 <w:color w:val="000000"/>
                 <w:sz w:val="28"/>
               </w:rPr>
-              <w:t>ลงชื่อ....................................................ผู้จัดเสนอผลงาน</w:t>
+              <w:t>ลงชื่อ​....................................................​ผู้​จัด​เสนอ​ผลงาน</w:t>
               <w:br/>
             </w:r>
             <w:r>
@@ -814,7 +814,7 @@
                 <w:color w:val="000000"/>
                 <w:sz w:val="28"/>
               </w:rPr>
-              <w:t>( ณัฐพล พัฒนกุล )</w:t>
+              <w:t>( ณัฐพล พัฒน​กุล )</w:t>
               <w:br/>
             </w:r>
             <w:r>
@@ -825,7 +825,7 @@
                 <w:color w:val="000000"/>
                 <w:sz w:val="26"/>
               </w:rPr>
-              <w:t>ตำแหน่ง อจ.รร.ขส.ขส.ทบ.</w:t>
+              <w:t>ตำแหน่ง อจ.​รร.​ขส.ขส.ทบ.</w:t>
               <w:br/>
             </w:r>
             <w:r>

</xml_diff>